<commit_message>
week 6 slide updates, report generated, top level slides generated, git ignore updated.
</commit_message>
<xml_diff>
--- a/Weekly Reports/Self_Driving_RC_Car.docx
+++ b/Weekly Reports/Self_Driving_RC_Car.docx
@@ -67,7 +67,7 @@
           <w:sz w:val="24"/>
           <w:szCs w:val="24"/>
         </w:rPr>
-        <w:t>9/22/2026</w:t>
+        <w:t>9/29/2026</w:t>
       </w:r>
       <w:r>
         <w:rPr>
@@ -277,7 +277,7 @@
           <w:szCs w:val="24"/>
           <w:u w:val="single"/>
         </w:rPr>
-        <w:t>Weekly Summary (9/22/2026):</w:t>
+        <w:t>Weekly Summary (9/29/2026):</w:t>
       </w:r>
     </w:p>
     <w:p>
@@ -298,7 +298,7 @@
         <w:rPr>
           <w:sz w:val="24"/>
         </w:rPr>
-        <w:t xml:space="preserve">This week the team moved from selecting parts to testing them on hardware. Ethan Wells set the machine-learning goals aside to get the compute ready for the rest of the team: he assembled the Raspberry Pi Compute Module 5 on the Compute Module 5 IO Board with its heatsink and PWM fan, CR2032 real-time-clock battery, and 27 W USB-C power supply, flashed Raspberry Pi OS Lite (64-bit) to the 128 GB NVMe solid-state drive that the board boots from, and brought the board up headless over SSH through a USB Wi-Fi dongle, which the CM5 needs because it has no onboard wireless; he traced very slow SSH throughput to the dongle's stock driver and replaced it with a working one, and wrote setup.sh so any team member can install the shared software prerequisites on a board with one command. Alexis Perez finalized the ultrasonic sensor implementation on the Pi, which measures distance to obstacles and walls, and tested the TT-style drive motors and L298N motor controller, finding performance issues that may require replacement parts; he also determined the hardware power requirements that will drive battery selection. Ethan Bishop ordered 2WD and 4WD Raspberry Pi HAT motor controllers and wrote code to test them for operational accuracy, and continued implementing the IMU, the sensor that reports the vehicle's heading and turns, verifying its measurements and directions. Abigail Duran prepared the libraries and software for the LCD1602 RGB status display, researched camera setup and configuration for the CM5, and identified the steps needed to integrate the camera and display with the machine-learning model.</w:t>
+        <w:t xml:space="preserve">This week the team finished bench-testing the core hardware on the Raspberry Pi and moved the sign-recognition model onto US traffic signs. Ethan Wells completed both of last week's machine-learning goals: he prepared the LISA Traffic Signs dataset (US signs) for training, writing prepare_lisa.py to validate the download, crop each annotated sign, and split the crops into training, validation, and test sets, narrowing the dataset's 47 sign classes to the 12 the car needs (6,097 cropped signs) and keeping every frame of the same physical sign in one split so near-identical images cannot appear in both training and testing; he also tested the German-sign (GTSRB) model on the 12,630-image GTSRB test set, where it reached 95.8% accuracy. Alexis Perez researched and presented the vehicle navigation options the team can use to follow the course, and completed an OpenCV course in preparation for the camera and image-processing pipeline. Ethan Bishop finished testing the Raspberry Pi HAT motor controllers for operational accuracy, running both HATs over I2C on the 40-pin GPIO header, and finished implementing the IMU, the sensor that reports the vehicle's heading and turns, over I2C and verified its measurements and directions; research on 3D-printable chassis files carries over to next week. Abigail Duran connected and communicated with the LCD status display and the camera from the Raspberry Pi Compute Module 5, and integrated both with the machine-learning model so detected signs and their corresponding commands are shown on the display.</w:t>
       </w:r>
     </w:p>
     <w:p>
@@ -342,7 +342,7 @@
         <w:rPr>
           <w:sz w:val="24"/>
         </w:rPr>
-        <w:t xml:space="preserve">Prepare the LISA dataset (US traffic signs) for training and test the trained German-sign (GTSRB) model.</w:t>
+        <w:t xml:space="preserve">Train a CNN on the prepared 12-class LISA dataset (US traffic signs) and test it on the LISA test split.</w:t>
       </w:r>
     </w:p>
     <w:p>
@@ -370,7 +370,7 @@
         <w:rPr>
           <w:sz w:val="24"/>
         </w:rPr>
-        <w:t xml:space="preserve">Select replacement motors and motor controller if the tested parts do not meet requirements, and narrow down the battery and power-supply options.</w:t>
+        <w:t xml:space="preserve">Research and purchase any components still missing for the selected navigation option, and continue learning OpenCV for the camera pipeline.</w:t>
       </w:r>
     </w:p>
     <w:p>
@@ -398,7 +398,7 @@
         <w:rPr>
           <w:sz w:val="24"/>
         </w:rPr>
-        <w:t xml:space="preserve">Finish testing the Pi HAT motor controllers, finish the IMU implementation on the Raspberry Pi, and research 3D-printable STL files for the chassis.</w:t>
+        <w:t xml:space="preserve">Research 3D-printable STL files for the chassis and research a possible ROS implementation for the vehicle.</w:t>
       </w:r>
     </w:p>
     <w:p>
@@ -426,7 +426,7 @@
         <w:rPr>
           <w:sz w:val="24"/>
         </w:rPr>
-        <w:t xml:space="preserve">Continue hardware testing and verify communication between the Raspberry Pi and all connected components, determine which components and connections go on the final PCB, and begin the PCB layout including component placement, board dimensions, power distribution, and signal routing.</w:t>
+        <w:t xml:space="preserve">Begin planning the PCB layout, including component placement and board dimensions, and begin planning power distribution and signal routing.</w:t>
       </w:r>
     </w:p>
     <w:p>
@@ -489,7 +489,7 @@
         <w:rPr>
           <w:sz w:val="24"/>
         </w:rPr>
-        <w:t xml:space="preserve">9/19/2026 – Assembled the CM5 on the Compute Module 5 IO Board with the heatsink and PWM fan, CR2032 RTC battery, and 27 W USB-C power supply, then flashed Raspberry Pi OS Lite (64-bit) to the 128 GB NVMe SSD and booted the board from M.2 (3 hours)</w:t>
+        <w:t xml:space="preserve">9/26/2026 – Downloaded the LISA Traffic Signs dataset from the Kaggle mirror after the UCSD download host was unavailable, and began the dataset preparation script (2 hours)</w:t>
       </w:r>
     </w:p>
     <w:p>
@@ -510,7 +510,7 @@
         <w:rPr>
           <w:sz w:val="24"/>
         </w:rPr>
-        <w:t xml:space="preserve">9/21/2026 – Brought up headless SSH over the USB Wi-Fi dongle and, after tracing very slow SSH throughput to the dongle's stock driver, replaced it with a working driver (2 hours)</w:t>
+        <w:t xml:space="preserve">9/28/2026 – Finished prepare_lisa.py, which validates the dataset, crops each annotated sign, narrows the 47 classes to the 12 the car needs, and splits the 6,097 crops by sign track into training, validation, and test sets; documented the steps in LISA_PREPARATION.md (2 hours)</w:t>
       </w:r>
     </w:p>
     <w:p>
@@ -531,7 +531,7 @@
         <w:rPr>
           <w:sz w:val="24"/>
         </w:rPr>
-        <w:t xml:space="preserve">9/23/2026 – Wrote setup.sh, a one-command install of the shared software prerequisites (git, python3, pip, venv), and updated the parts list with the remaining compute purchases (2 hours)</w:t>
+        <w:t xml:space="preserve">9/29/2026 – Tested the German-sign (GTSRB) model on the 12,630-image GTSRB test set, reaching 95.8% accuracy, and saved the results to gtsrb_test_results.json (3 hours)</w:t>
       </w:r>
     </w:p>
     <w:p>
@@ -574,7 +574,7 @@
         <w:rPr>
           <w:sz w:val="24"/>
         </w:rPr>
-        <w:t xml:space="preserve">Finalized the ultrasonic sensor implementation on the Raspberry Pi, including additional distance-reading and range testing</w:t>
+        <w:t xml:space="preserve">Researched, finalized, and presented the vehicle navigation options</w:t>
       </w:r>
     </w:p>
     <w:p>
@@ -595,7 +595,7 @@
         <w:rPr>
           <w:sz w:val="24"/>
         </w:rPr>
-        <w:t xml:space="preserve">Tested the TT-style drive motors and L298N motor controller for performance and identified issues with the current components</w:t>
+        <w:t xml:space="preserve">Completed an OpenCV course in preparation for the camera and image-processing pipeline</w:t>
       </w:r>
     </w:p>
     <w:p>
@@ -614,9 +614,10 @@
       <w:proofErr w:type="spellEnd"/>
       <w:r>
         <w:rPr>
-          <w:sz w:val="24"/>
-        </w:rPr>
-        <w:t xml:space="preserve">Determined the hardware power requirements to guide battery and power-supply selection</w:t>
+          <w:u w:val="single"/>
+          <w:sz w:val="24"/>
+        </w:rPr>
+        <w:t xml:space="preserve">Ethan Bishop:</w:t>
       </w:r>
     </w:p>
     <w:p>
@@ -635,10 +636,9 @@
       <w:proofErr w:type="spellEnd"/>
       <w:r>
         <w:rPr>
-          <w:u w:val="single"/>
-          <w:sz w:val="24"/>
-        </w:rPr>
-        <w:t xml:space="preserve">Ethan Bishop:</w:t>
+          <w:sz w:val="24"/>
+        </w:rPr>
+        <w:t xml:space="preserve">Tested the Raspberry Pi HAT motor controllers for operational accuracy, running both HATs over I2C on the 40-pin GPIO header</w:t>
       </w:r>
     </w:p>
     <w:p>
@@ -659,7 +659,7 @@
         <w:rPr>
           <w:sz w:val="24"/>
         </w:rPr>
-        <w:t xml:space="preserve">Ordered 2WD and 4WD Raspberry Pi HAT motor controllers and wrote code to test them for operational accuracy</w:t>
+        <w:t xml:space="preserve">Implemented the IMU on the Raspberry Pi over I2C and verified its measurements and directions</w:t>
       </w:r>
     </w:p>
     <w:p>
@@ -678,9 +678,10 @@
       <w:proofErr w:type="spellEnd"/>
       <w:r>
         <w:rPr>
-          <w:sz w:val="24"/>
-        </w:rPr>
-        <w:t xml:space="preserve">Continued implementing the IMU on the Raspberry Pi and verified its measurements and directions</w:t>
+          <w:u w:val="single"/>
+          <w:sz w:val="24"/>
+        </w:rPr>
+        <w:t xml:space="preserve">Abigail Duran:</w:t>
       </w:r>
     </w:p>
     <w:p>
@@ -699,10 +700,9 @@
       <w:proofErr w:type="spellEnd"/>
       <w:r>
         <w:rPr>
-          <w:u w:val="single"/>
-          <w:sz w:val="24"/>
-        </w:rPr>
-        <w:t xml:space="preserve">Abigail Duran:</w:t>
+          <w:sz w:val="24"/>
+        </w:rPr>
+        <w:t xml:space="preserve">Connected and communicated with the LCD and camera using the Raspberry Pi Compute Module 5</w:t>
       </w:r>
     </w:p>
     <w:p>
@@ -723,49 +723,7 @@
         <w:rPr>
           <w:sz w:val="24"/>
         </w:rPr>
-        <w:t xml:space="preserve">Prepared the necessary libraries and software for the LCD1602 RGB display module</w:t>
-      </w:r>
-    </w:p>
-    <w:p>
-      <w:pPr>
-        <w:numPr>
-          <w:ilvl w:val="0"/>
-          <w:numId w:val="7"/>
-        </w:numPr>
-        <w:spacing w:before="240"/>
-        <w:rPr>
-          <w:sz w:val="24"/>
-          <w:szCs w:val="24"/>
-        </w:rPr>
-      </w:pPr>
-      <w:proofErr w:type="spellStart"/>
-      <w:proofErr w:type="spellEnd"/>
-      <w:r>
-        <w:rPr>
-          <w:sz w:val="24"/>
-        </w:rPr>
-        <w:t xml:space="preserve">Researched camera setup and configuration for the Raspberry Pi Compute Module 5</w:t>
-      </w:r>
-    </w:p>
-    <w:p>
-      <w:pPr>
-        <w:numPr>
-          <w:ilvl w:val="0"/>
-          <w:numId w:val="7"/>
-        </w:numPr>
-        <w:spacing w:before="240"/>
-        <w:rPr>
-          <w:sz w:val="24"/>
-          <w:szCs w:val="24"/>
-        </w:rPr>
-      </w:pPr>
-      <w:proofErr w:type="spellStart"/>
-      <w:proofErr w:type="spellEnd"/>
-      <w:r>
-        <w:rPr>
-          <w:sz w:val="24"/>
-        </w:rPr>
-        <w:t xml:space="preserve">Identified the steps needed to integrate the camera and LCD with the machine-learning model</w:t>
+        <w:t xml:space="preserve">Integrated the LCD and camera with the machine-learning model to display detected signs and their corresponding commands</w:t>
       </w:r>
     </w:p>
     <w:p>
@@ -1039,7 +997,7 @@
               <w:rPr>
                 <w:sz w:val="24"/>
               </w:rPr>
-              <w:t xml:space="preserve">19</w:t>
+              <w:t xml:space="preserve">26</w:t>
             </w:r>
           </w:p>
         </w:tc>
@@ -1143,7 +1101,7 @@
               <w:rPr>
                 <w:sz w:val="24"/>
               </w:rPr>
-              <w:t xml:space="preserve">16</w:t>
+              <w:t xml:space="preserve">23</w:t>
             </w:r>
           </w:p>
         </w:tc>
@@ -1213,7 +1171,7 @@
               <w:rPr>
                 <w:sz w:val="24"/>
               </w:rPr>
-              <w:t xml:space="preserve">6</w:t>
+              <w:t xml:space="preserve">7</w:t>
             </w:r>
           </w:p>
         </w:tc>
@@ -1247,7 +1205,7 @@
               <w:rPr>
                 <w:sz w:val="24"/>
               </w:rPr>
-              <w:t xml:space="preserve">15</w:t>
+              <w:t xml:space="preserve">22</w:t>
             </w:r>
           </w:p>
         </w:tc>
@@ -1351,7 +1309,7 @@
               <w:rPr>
                 <w:sz w:val="24"/>
               </w:rPr>
-              <w:t xml:space="preserve">17</w:t>
+              <w:t xml:space="preserve">23</w:t>
             </w:r>
           </w:p>
         </w:tc>

</xml_diff>

<commit_message>
Week 8 report, deck, archive, and parts list update
</commit_message>
<xml_diff>
--- a/Weekly Reports/Self_Driving_RC_Car.docx
+++ b/Weekly Reports/Self_Driving_RC_Car.docx
@@ -67,7 +67,7 @@
           <w:sz w:val="24"/>
           <w:szCs w:val="24"/>
         </w:rPr>
-        <w:t>10/6/2026</w:t>
+        <w:t>10/13/2026</w:t>
       </w:r>
       <w:r>
         <w:rPr>
@@ -253,7 +253,7 @@
           <w:szCs w:val="24"/>
           <w:u w:val="single"/>
         </w:rPr>
-        <w:t>Weekly Summary (10/6/2026):</w:t>
+        <w:t>Weekly Summary (10/13/2026):</w:t>
       </w:r>
     </w:p>
     <w:p>
@@ -274,7 +274,7 @@
         <w:rPr>
           <w:sz w:val="24"/>
         </w:rPr>
-        <w:t xml:space="preserve">This week the team moved from preparing US traffic-sign data to testing a model and narrowing hardware choices for the vehicle. Ethan Wells completed last week's goal of training and testing a CNN on the prepared 12-class LISA dataset. It reached 89.90% accuracy on 584 held-out test crops. He reviewed the classes with lower accuracy and prepared 3,449 Mapillary sign crops for the next training run. Alexis Perez selected and ordered line sensors to help the car follow the course, and completed an OpenCV beginner course. Ethan Bishop found 3D-printable chassis plate files and continued researching whether ROS 2 would fit the vehicle's software. Abigail Duran organized the components and connections needed for the custom PCB and reviewed the Compute Module 5 IO Board to determine which features to keep. PCB layout work carries into next week.</w:t>
+        <w:t xml:space="preserve">This week the team compared sign-recognition models, outlined a possible software structure for the vehicle, and continued the custom PCB. Ethan Wells completed last week's goal of training and testing a CNN on the prepared Mapillary sign data. It reached 92.59% accuracy on its 432 test crops. He then combined the LISA and Mapillary datasets and trained a model on both. On the same 1,016 held-out test crops, the combined model reached 99.31% accuracy, compared with 84.94% for the LISA model and 72.05% for the Mapillary model. These scores use cropped road-scene images, not BuggyBot's camera, so he prepared printable cards for the 12 sign classes for camera testing. Alexis Perez completed the OpenCV beginner course and worked on integrating the line sensors with the Raspberry Pi. TCRT5000 IR line sensors and AEDIKO TT motors with wheels were purchased on 10/13. Using OpenCV with the Raspberry Pi camera carries into next week. Ethan Bishop continued researching ROS 2 and outlined a possible node structure for the vehicle: camera, sign detector, IMU, behavior, motor driver, LCD, and manual-control nodes. Abigail Duran added the BuggyBot KiCad project files to the repository and removed unnecessary components from the schematic and PCB layout. Component placement, power distribution, and signal routing carry into next week.</w:t>
       </w:r>
     </w:p>
     <w:p>
@@ -318,7 +318,7 @@
         <w:rPr>
           <w:sz w:val="24"/>
         </w:rPr>
-        <w:t xml:space="preserve">Train and test a CNN on the prepared Mapillary sign data; if time allows, combine the LISA and Mapillary datasets and test a model trained on both.</w:t>
+        <w:t xml:space="preserve">Print the sign cards and capture images of them with the CM5 camera at set distances and angles; score the camera crops separately from the road-scene crop benchmark.</w:t>
       </w:r>
     </w:p>
     <w:p>
@@ -344,7 +344,7 @@
         <w:rPr>
           <w:sz w:val="24"/>
         </w:rPr>
-        <w:t xml:space="preserve">Connect the line sensors to the Raspberry Pi and begin using OpenCV with the Raspberry Pi camera.</w:t>
+        <w:t xml:space="preserve">Implement OpenCV with the Raspberry Pi camera.</w:t>
       </w:r>
     </w:p>
     <w:p>
@@ -370,7 +370,7 @@
         <w:rPr>
           <w:sz w:val="24"/>
         </w:rPr>
-        <w:t xml:space="preserve">Continue researching ROS 2 and assess the proposed camera, sign detector, behavior, and motor driver nodes for the vehicle.</w:t>
+        <w:t xml:space="preserve">Continue researching a possible ROS 2 implementation for the vehicle.</w:t>
       </w:r>
     </w:p>
     <w:p>
@@ -396,7 +396,7 @@
         <w:rPr>
           <w:sz w:val="24"/>
         </w:rPr>
-        <w:t xml:space="preserve">Begin the PCB layout, including component placement, board dimensions, power distribution, and signal routing; transfer the selected components into the design.</w:t>
+        <w:t xml:space="preserve">Continue developing the PCB design and component placement, begin planning power distribution and signal routing, and work toward finalizing the PCB design for manufacturing.</w:t>
       </w:r>
     </w:p>
     <w:p>
@@ -453,7 +453,7 @@
         <w:rPr>
           <w:sz w:val="24"/>
         </w:rPr>
-        <w:t xml:space="preserve">10/2/2026 – Trained the CNN on the prepared 12-class LISA sign dataset (2 hours)</w:t>
+        <w:t xml:space="preserve">Trained and tested the CNN on the Mapillary sign data, reviewed the results, and combined the LISA and Mapillary datasets into 7,601 training, 929 validation, and 1,016 test crops</w:t>
       </w:r>
     </w:p>
     <w:p>
@@ -471,7 +471,7 @@
         <w:rPr>
           <w:sz w:val="24"/>
         </w:rPr>
-        <w:t xml:space="preserve">10/5/2026 – Tested the LISA model on the held-out test set and reviewed the per-class results (2 hours)</w:t>
+        <w:t xml:space="preserve">Trained the combined model (99.31% accuracy on 1,016 test crops) and compared the LISA, Mapillary, and combined models on the same test crops</w:t>
       </w:r>
     </w:p>
     <w:p>
@@ -489,7 +489,7 @@
         <w:rPr>
           <w:sz w:val="24"/>
         </w:rPr>
-        <w:t xml:space="preserve">10/6/2026 – Prepared 3,449 Mapillary sign crops for the same 12 classes (3 hours)</w:t>
+        <w:t xml:space="preserve">Prepared printable cards for the 12 sign classes, and prepared the weekly slides and report</w:t>
       </w:r>
     </w:p>
     <w:p>
@@ -526,7 +526,7 @@
         <w:rPr>
           <w:sz w:val="24"/>
         </w:rPr>
-        <w:t xml:space="preserve">Selected and ordered line sensors for course following</w:t>
+        <w:t xml:space="preserve">Completed the OpenCV beginner course</w:t>
       </w:r>
     </w:p>
     <w:p>
@@ -544,7 +544,7 @@
         <w:rPr>
           <w:sz w:val="24"/>
         </w:rPr>
-        <w:t xml:space="preserve">Completed an OpenCV beginner course</w:t>
+        <w:t xml:space="preserve">Worked on integrating the line sensors with the Raspberry Pi</w:t>
       </w:r>
     </w:p>
     <w:p>
@@ -581,7 +581,7 @@
         <w:rPr>
           <w:sz w:val="24"/>
         </w:rPr>
-        <w:t xml:space="preserve">Researched 3D-printable chassis plate files</w:t>
+        <w:t xml:space="preserve">Continued researching a possible ROS 2 implementation for the vehicle</w:t>
       </w:r>
     </w:p>
     <w:p>
@@ -599,7 +599,7 @@
         <w:rPr>
           <w:sz w:val="24"/>
         </w:rPr>
-        <w:t xml:space="preserve">Continued researching a possible ROS 2 implementation for the vehicle</w:t>
+        <w:t xml:space="preserve">Outlined a preliminary ROS 2 node structure for the camera, sign detector, IMU, behavior, motor driver, LCD, and manual control</w:t>
       </w:r>
     </w:p>
     <w:p>
@@ -636,7 +636,7 @@
         <w:rPr>
           <w:sz w:val="24"/>
         </w:rPr>
-        <w:t xml:space="preserve">Organized the components and connections needed for the custom PCB</w:t>
+        <w:t xml:space="preserve">Added the BuggyBot KiCad project files to the repository</w:t>
       </w:r>
     </w:p>
     <w:p>
@@ -654,7 +654,25 @@
         <w:rPr>
           <w:sz w:val="24"/>
         </w:rPr>
-        <w:t xml:space="preserve">Reviewed the Compute Module 5 IO Board to determine which features to keep in the custom design</w:t>
+        <w:t xml:space="preserve">Created a component checklist for the PCB design</w:t>
+      </w:r>
+    </w:p>
+    <w:p>
+      <w:pPr>
+        <w:numPr>
+          <w:ilvl w:val="1"/>
+          <w:numId w:val="6"/>
+        </w:numPr>
+        <w:rPr>
+          <w:sz w:val="24"/>
+          <w:szCs w:val="24"/>
+        </w:rPr>
+      </w:pPr>
+      <w:r>
+        <w:rPr>
+          <w:sz w:val="24"/>
+        </w:rPr>
+        <w:t xml:space="preserve">Removed unnecessary components from the schematic and PCB layout</w:t>
       </w:r>
     </w:p>
     <w:p>
@@ -879,7 +897,7 @@
               <w:rPr>
                 <w:sz w:val="24"/>
               </w:rPr>
-              <w:t xml:space="preserve">7</w:t>
+              <w:t xml:space="preserve">8</w:t>
             </w:r>
           </w:p>
         </w:tc>
@@ -913,7 +931,7 @@
               <w:rPr>
                 <w:sz w:val="24"/>
               </w:rPr>
-              <w:t xml:space="preserve">33</w:t>
+              <w:t xml:space="preserve">41</w:t>
             </w:r>
           </w:p>
         </w:tc>
@@ -1017,7 +1035,7 @@
               <w:rPr>
                 <w:sz w:val="24"/>
               </w:rPr>
-              <w:t xml:space="preserve">29</w:t>
+              <w:t xml:space="preserve">35</w:t>
             </w:r>
           </w:p>
         </w:tc>
@@ -1121,7 +1139,7 @@
               <w:rPr>
                 <w:sz w:val="24"/>
               </w:rPr>
-              <w:t xml:space="preserve">28</w:t>
+              <w:t xml:space="preserve">34</w:t>
             </w:r>
           </w:p>
         </w:tc>
@@ -1225,7 +1243,7 @@
               <w:rPr>
                 <w:sz w:val="24"/>
               </w:rPr>
-              <w:t xml:space="preserve">29</w:t>
+              <w:t xml:space="preserve">35</w:t>
             </w:r>
           </w:p>
         </w:tc>

</xml_diff>

<commit_message>
Week 9: weekly report, Week 9 archive, and documentation refresh
</commit_message>
<xml_diff>
--- a/Weekly Reports/Self_Driving_RC_Car.docx
+++ b/Weekly Reports/Self_Driving_RC_Car.docx
@@ -67,7 +67,7 @@
           <w:sz w:val="24"/>
           <w:szCs w:val="24"/>
         </w:rPr>
-        <w:t>10/13/2026</w:t>
+        <w:t>10/20/2026</w:t>
       </w:r>
       <w:r>
         <w:rPr>
@@ -253,7 +253,7 @@
           <w:szCs w:val="24"/>
           <w:u w:val="single"/>
         </w:rPr>
-        <w:t>Weekly Summary (10/13/2026):</w:t>
+        <w:t>Weekly Summary (10/20/2026):</w:t>
       </w:r>
     </w:p>
     <w:p>
@@ -274,7 +274,7 @@
         <w:rPr>
           <w:sz w:val="24"/>
         </w:rPr>
-        <w:t xml:space="preserve">This week the team compared sign-recognition models, outlined a possible software structure for the vehicle, and continued the custom PCB. Ethan Wells completed last week's goal of training and testing a CNN on the prepared Mapillary sign data. It reached 92.59% accuracy on its 432 test crops. He then combined the LISA and Mapillary datasets and trained a model on both. On the same 1,016 held-out test crops, the combined model reached 99.31% accuracy, compared with 84.94% for the LISA model and 72.05% for the Mapillary model. These scores use cropped road-scene images, not BuggyBot's camera, so he prepared printable cards for the 12 sign classes for camera testing. Alexis Perez completed the OpenCV beginner course and worked on integrating the line sensors with the Raspberry Pi. TCRT5000 IR line sensors and AEDIKO TT motors with wheels were purchased on 10/13. Using OpenCV with the Raspberry Pi camera carries into next week. Ethan Bishop continued researching ROS 2 and outlined a possible node structure for the vehicle: camera, sign detector, IMU, behavior, motor driver, LCD, and manual-control nodes. Abigail Duran added the BuggyBot KiCad project files to the repository and removed unnecessary components from the schematic and PCB layout. Component placement, power distribution, and signal routing carry into next week.</w:t>
+        <w:t xml:space="preserve">This week the team tested the traffic-sign classifier with BuggyBot's own camera, studied ROS 2 for the vehicle software, and continued the custom PCB design. Ethan Wells completed last week's goal of printing the sign cards and photographing them with the Raspberry Pi Camera Module 3 on the CM5. He captured 10 of the 12 sign classes under three lighting conditions (no light, sunlight, and sunlight plus artificial light) and cut 329 sign crops with an OpenCV template-matching script. On those 329 camera crops the combined model classified every crop correctly (100% top-1), against 47.7% for the LISA model and 79.9% for the Mapillary model. The crops were cut with each sign's known class, so this measures sign classification and not automatic sign detection. He also reorganized the Hardware and Model Training folders, updated the maintained documentation, and repaired the links to the moved files. Alexis Perez continued his OpenCV learning and tested OpenCV on a webcam, ordered a car chassis so the vehicle components can be tested together, and wrote a TCRT5000 IR line-sensor script for the Raspberry Pi that reads the left and right course-line sensors on GPIO17 and GPIO27 and reports a lane action. Ethan Bishop installed ROS 2 under Windows Subsystem for Linux and drafted the node architecture for the vehicle: camera, sign detector, line sensor, IMU, behavior, motor driver, LCD, and teleop. He also drafted the data flow, in which the behavior node turns lane, sign, and IMU data into driving decisions. Abigail Duran created an organized component checklist for the PCB design, reviewed the CM5 IO Board components and connections to decide which features are kept, removed, or modified, and added the IMU and LCD connectors to the board layout. Connecting the combined classifier to the CM5 camera and LCD pipeline, and measuring crops taken without using the known sign class, carry into next week.</w:t>
       </w:r>
     </w:p>
     <w:p>
@@ -318,7 +318,7 @@
         <w:rPr>
           <w:sz w:val="24"/>
         </w:rPr>
-        <w:t xml:space="preserve">Print the sign cards and capture images of them with the CM5 camera at set distances and angles; score the camera crops separately from the road-scene crop benchmark.</w:t>
+        <w:t xml:space="preserve">Connect the combined classifier to the CM5 camera and LCD pipeline, evaluate automatic sign crops that do not use the known sign class, and capture new setups at measured distances and angles while recording accuracy and inference time.</w:t>
       </w:r>
     </w:p>
     <w:p>
@@ -370,7 +370,7 @@
         <w:rPr>
           <w:sz w:val="24"/>
         </w:rPr>
-        <w:t xml:space="preserve">Continue researching a possible ROS 2 implementation for the vehicle.</w:t>
+        <w:t xml:space="preserve">Create a test program for the ROS 2 implementation.</w:t>
       </w:r>
     </w:p>
     <w:p>
@@ -396,7 +396,7 @@
         <w:rPr>
           <w:sz w:val="24"/>
         </w:rPr>
-        <w:t xml:space="preserve">Continue developing the PCB design and component placement, begin planning power distribution and signal routing, and work toward finalizing the PCB design for manufacturing.</w:t>
+        <w:t xml:space="preserve">Continue developing the PCB design and component placement, and work toward finalizing the PCB design for manufacturing.</w:t>
       </w:r>
     </w:p>
     <w:p>
@@ -453,7 +453,7 @@
         <w:rPr>
           <w:sz w:val="24"/>
         </w:rPr>
-        <w:t xml:space="preserve">Trained and tested the CNN on the Mapillary sign data, reviewed the results, and combined the LISA and Mapillary datasets into 7,601 training, 929 validation, and 1,016 test crops</w:t>
+        <w:t xml:space="preserve">Photographed the printed sign cards with the CM5 camera: 10 sign classes under three lighting conditions, cut into 329 sign crops with an OpenCV template-matching script (5 hours)</w:t>
       </w:r>
     </w:p>
     <w:p>
@@ -471,7 +471,7 @@
         <w:rPr>
           <w:sz w:val="24"/>
         </w:rPr>
-        <w:t xml:space="preserve">Trained the combined model (99.31% accuracy on 1,016 test crops) and compared the LISA, Mapillary, and combined models on the same test crops</w:t>
+        <w:t xml:space="preserve">Scored the LISA, Mapillary, and combined models on the same 329 camera crops (combined 329 of 329 correct, LISA 47.7%, Mapillary 79.9%)</w:t>
       </w:r>
     </w:p>
     <w:p>
@@ -489,7 +489,25 @@
         <w:rPr>
           <w:sz w:val="24"/>
         </w:rPr>
-        <w:t xml:space="preserve">Prepared printable cards for the 12 sign classes, and prepared the weekly slides and report</w:t>
+        <w:t xml:space="preserve">Reorganized the Hardware and Model Training folders, updated the maintained documentation, and repaired links to the moved files (1 hour)</w:t>
+      </w:r>
+    </w:p>
+    <w:p>
+      <w:pPr>
+        <w:numPr>
+          <w:ilvl w:val="1"/>
+          <w:numId w:val="6"/>
+        </w:numPr>
+        <w:rPr>
+          <w:sz w:val="24"/>
+          <w:szCs w:val="24"/>
+        </w:rPr>
+      </w:pPr>
+      <w:r>
+        <w:rPr>
+          <w:sz w:val="24"/>
+        </w:rPr>
+        <w:t xml:space="preserve">Prepared the weekly slides and report (1 hour)</w:t>
       </w:r>
     </w:p>
     <w:p>
@@ -526,7 +544,7 @@
         <w:rPr>
           <w:sz w:val="24"/>
         </w:rPr>
-        <w:t xml:space="preserve">Completed the OpenCV beginner course</w:t>
+        <w:t xml:space="preserve">Continued the OpenCV course and tested OpenCV on a webcam (2 hours)</w:t>
       </w:r>
     </w:p>
     <w:p>
@@ -544,7 +562,25 @@
         <w:rPr>
           <w:sz w:val="24"/>
         </w:rPr>
-        <w:t xml:space="preserve">Worked on integrating the line sensors with the Raspberry Pi</w:t>
+        <w:t xml:space="preserve">Ordered a car chassis to test the vehicle components together (1 hour)</w:t>
+      </w:r>
+    </w:p>
+    <w:p>
+      <w:pPr>
+        <w:numPr>
+          <w:ilvl w:val="1"/>
+          <w:numId w:val="6"/>
+        </w:numPr>
+        <w:rPr>
+          <w:sz w:val="24"/>
+          <w:szCs w:val="24"/>
+        </w:rPr>
+      </w:pPr>
+      <w:r>
+        <w:rPr>
+          <w:sz w:val="24"/>
+        </w:rPr>
+        <w:t xml:space="preserve">Wrote a TCRT5000 IR line-sensor script for the Raspberry Pi that reads the left and right course-line sensors and reports a lane action (3 hours)</w:t>
       </w:r>
     </w:p>
     <w:p>
@@ -581,7 +617,7 @@
         <w:rPr>
           <w:sz w:val="24"/>
         </w:rPr>
-        <w:t xml:space="preserve">Continued researching a possible ROS 2 implementation for the vehicle</w:t>
+        <w:t xml:space="preserve">Installed ROS 2 under Windows Subsystem for Linux and drafted the ROS 2 node structure for the camera, sign detector, line sensor, IMU, behavior, motor driver, LCD, and teleop (4 hours)</w:t>
       </w:r>
     </w:p>
     <w:p>
@@ -599,7 +635,7 @@
         <w:rPr>
           <w:sz w:val="24"/>
         </w:rPr>
-        <w:t xml:space="preserve">Outlined a preliminary ROS 2 node structure for the camera, sign detector, IMU, behavior, motor driver, LCD, and manual control</w:t>
+        <w:t xml:space="preserve">Drafted the ROS 2 data flow in which the behavior node turns lane, sign, and IMU data into driving decisions (2 hours)</w:t>
       </w:r>
     </w:p>
     <w:p>
@@ -636,7 +672,7 @@
         <w:rPr>
           <w:sz w:val="24"/>
         </w:rPr>
-        <w:t xml:space="preserve">Added the BuggyBot KiCad project files to the repository</w:t>
+        <w:t xml:space="preserve">Created an organized component checklist/spreadsheet for the PCB design (2 hours)</w:t>
       </w:r>
     </w:p>
     <w:p>
@@ -654,7 +690,7 @@
         <w:rPr>
           <w:sz w:val="24"/>
         </w:rPr>
-        <w:t xml:space="preserve">Created a component checklist for the PCB design</w:t>
+        <w:t xml:space="preserve">Reviewed the CM5 IO Board components and connections to determine which features should be kept, removed, or modified (2 hours)</w:t>
       </w:r>
     </w:p>
     <w:p>
@@ -672,7 +708,7 @@
         <w:rPr>
           <w:sz w:val="24"/>
         </w:rPr>
-        <w:t xml:space="preserve">Removed unnecessary components from the schematic and PCB layout</w:t>
+        <w:t xml:space="preserve">Added the IMU and LCD connectors to the board layout (2 hours)</w:t>
       </w:r>
     </w:p>
     <w:p>
@@ -897,7 +933,7 @@
               <w:rPr>
                 <w:sz w:val="24"/>
               </w:rPr>
-              <w:t xml:space="preserve">8</w:t>
+              <w:t xml:space="preserve">7</w:t>
             </w:r>
           </w:p>
         </w:tc>
@@ -931,7 +967,7 @@
               <w:rPr>
                 <w:sz w:val="24"/>
               </w:rPr>
-              <w:t xml:space="preserve">41</w:t>
+              <w:t xml:space="preserve">48</w:t>
             </w:r>
           </w:p>
         </w:tc>
@@ -1035,7 +1071,7 @@
               <w:rPr>
                 <w:sz w:val="24"/>
               </w:rPr>
-              <w:t xml:space="preserve">35</w:t>
+              <w:t xml:space="preserve">41</w:t>
             </w:r>
           </w:p>
         </w:tc>
@@ -1139,7 +1175,7 @@
               <w:rPr>
                 <w:sz w:val="24"/>
               </w:rPr>
-              <w:t xml:space="preserve">34</w:t>
+              <w:t xml:space="preserve">40</w:t>
             </w:r>
           </w:p>
         </w:tc>
@@ -1243,7 +1279,7 @@
               <w:rPr>
                 <w:sz w:val="24"/>
               </w:rPr>
-              <w:t xml:space="preserve">35</w:t>
+              <w:t xml:space="preserve">41</w:t>
             </w:r>
           </w:p>
         </w:tc>

</xml_diff>

<commit_message>
Week 10: weekly report and Week 10 archive
</commit_message>
<xml_diff>
--- a/Weekly Reports/Self_Driving_RC_Car.docx
+++ b/Weekly Reports/Self_Driving_RC_Car.docx
@@ -67,7 +67,7 @@
           <w:sz w:val="24"/>
           <w:szCs w:val="24"/>
         </w:rPr>
-        <w:t>10/20/2026</w:t>
+        <w:t>10/27/2026</w:t>
       </w:r>
       <w:r>
         <w:rPr>
@@ -253,7 +253,7 @@
           <w:szCs w:val="24"/>
           <w:u w:val="single"/>
         </w:rPr>
-        <w:t>Weekly Summary (10/20/2026):</w:t>
+        <w:t>Weekly Summary (10/27/2026):</w:t>
       </w:r>
     </w:p>
     <w:p>
@@ -274,7 +274,7 @@
         <w:rPr>
           <w:sz w:val="24"/>
         </w:rPr>
-        <w:t xml:space="preserve">This week the team tested the traffic-sign classifier with BuggyBot's own camera, studied ROS 2 for the vehicle software, and continued the custom PCB design. Ethan Wells completed last week's goal of printing the sign cards and photographing them with the Raspberry Pi Camera Module 3 on the CM5. He captured 10 of the 12 sign classes under three lighting conditions (no light, sunlight, and sunlight plus artificial light) and cut 329 sign crops with an OpenCV template-matching script. On those 329 camera crops the combined model classified every crop correctly (100% top-1), against 47.7% for the LISA model and 79.9% for the Mapillary model. The crops were cut with each sign's known class, so this measures sign classification and not automatic sign detection. He also reorganized the Hardware and Model Training folders, updated the maintained documentation, and repaired the links to the moved files. Alexis Perez continued his OpenCV learning and tested OpenCV on a webcam, ordered a car chassis so the vehicle components can be tested together, and wrote a TCRT5000 IR line-sensor script for the Raspberry Pi that reads the left and right course-line sensors on GPIO17 and GPIO27 and reports a lane action. Ethan Bishop installed ROS 2 under Windows Subsystem for Linux and drafted the node architecture for the vehicle: camera, sign detector, line sensor, IMU, behavior, motor driver, LCD, and teleop. He also drafted the data flow, in which the behavior node turns lane, sign, and IMU data into driving decisions. Abigail Duran created an organized component checklist for the PCB design, reviewed the CM5 IO Board components and connections to decide which features are kept, removed, or modified, and added the IMU and LCD connectors to the board layout. Connecting the combined classifier to the CM5 camera and LCD pipeline, and measuring crops taken without using the known sign class, carry into next week.</w:t>
+        <w:t xml:space="preserve">This week the team ran live traffic-sign recognition on BuggyBot, built a test script for every sensor and the motor driver, and continued the custom PCB design. Alexis Perez met last week's goal of implementing OpenCV with the Raspberry Pi camera: he wrote the first sign-detection demo script for the CM5, which captures frames from the Raspberry Pi Camera Module 3, finds sign-shaped regions with OpenCV, classifies them with the combined model, and shows the result on the LCD. He also moved the TCRT5000 line sensors to GPIO20 and GPIO21 so they no longer share pins with the Cokoino motor HAT. Ethan Wells met two of last week's three goals. He connected the combined classifier to the CM5 camera and LCD through Alexis's demo and tested it live with signs located automatically, without using the known sign class. Live testing showed false detections, so he added a browser video stream (the Pi has no desktop), LCD backlight colors by sign, color and shape checks that stop hands, faces, and shirts from being read as stop signs, whole-sign cropping so the added-lane sign is no longer read as merge, and a rule that the same sign must be read on 3 frames in a row before it reaches the LCD. In the final live test all 10 printed sign classes were shown 3 times each over two runs, and 60 of 60 LCD outputs were correct. He documented the problems and fixes in a troubleshooting guide. Measuring accuracy and inference time at set distances and angles carries into a later week. Ethan Bishop built a master test script that checks the line sensors, IMU, camera, LCD, and motor driver in turn and prints a pass/fail summary, ran the ROS 2 turtlesim tutorial under Windows Subsystem for Linux, and started the ROS 2 test program from last week's goal. Abigail Duran continued the PCB design toward manufacturing: she added the required new components to the board, began tracing the connections, and ordered STEMMA QT / Qwiic I2C cables for connecting the I2C boards.</w:t>
       </w:r>
     </w:p>
     <w:p>
@@ -318,7 +318,7 @@
         <w:rPr>
           <w:sz w:val="24"/>
         </w:rPr>
-        <w:t xml:space="preserve">Connect the combined classifier to the CM5 camera and LCD pipeline, evaluate automatic sign crops that do not use the known sign class, and capture new setups at measured distances and angles while recording accuracy and inference time.</w:t>
+        <w:t xml:space="preserve">Run a full sensor test on the CM5 I/O board, then give Abigail Duran final approval to send the PCB design for manufacturing.</w:t>
       </w:r>
     </w:p>
     <w:p>
@@ -344,7 +344,7 @@
         <w:rPr>
           <w:sz w:val="24"/>
         </w:rPr>
-        <w:t xml:space="preserve">Implement OpenCV with the Raspberry Pi camera.</w:t>
+        <w:t xml:space="preserve">Fine-tune OpenCV on the Raspberry Pi and test all components.</w:t>
       </w:r>
     </w:p>
     <w:p>
@@ -370,7 +370,7 @@
         <w:rPr>
           <w:sz w:val="24"/>
         </w:rPr>
-        <w:t xml:space="preserve">Create a test program for the ROS 2 implementation.</w:t>
+        <w:t xml:space="preserve">Write a first ROS 2 test node and run it on the CM5.</w:t>
       </w:r>
     </w:p>
     <w:p>
@@ -396,7 +396,7 @@
         <w:rPr>
           <w:sz w:val="24"/>
         </w:rPr>
-        <w:t xml:space="preserve">Continue developing the PCB design and component placement, and work toward finalizing the PCB design for manufacturing.</w:t>
+        <w:t xml:space="preserve">Generate all required files for manufacturing and place the PCB order.</w:t>
       </w:r>
     </w:p>
     <w:p>
@@ -453,7 +453,7 @@
         <w:rPr>
           <w:sz w:val="24"/>
         </w:rPr>
-        <w:t xml:space="preserve">Photographed the printed sign cards with the CM5 camera: 10 sign classes under three lighting conditions, cut into 329 sign crops with an OpenCV template-matching script (5 hours)</w:t>
+        <w:t xml:space="preserve">Connected the combined classifier to the CM5 camera and LCD through Alexis Perez's sign demo and tested it live on BuggyBot</w:t>
       </w:r>
     </w:p>
     <w:p>
@@ -471,7 +471,7 @@
         <w:rPr>
           <w:sz w:val="24"/>
         </w:rPr>
-        <w:t xml:space="preserve">Scored the LISA, Mapillary, and combined models on the same 329 camera crops (combined 329 of 329 correct, LISA 47.7%, Mapillary 79.9%)</w:t>
+        <w:t xml:space="preserve">Fixed false detections found in live testing: color and shape checks, whole-sign cropping, and 3-frame confirmation; added a browser video stream and LCD colors by sign</w:t>
       </w:r>
     </w:p>
     <w:p>
@@ -489,7 +489,7 @@
         <w:rPr>
           <w:sz w:val="24"/>
         </w:rPr>
-        <w:t xml:space="preserve">Reorganized the Hardware and Model Training folders, updated the maintained documentation, and repaired links to the moved files (1 hour)</w:t>
+        <w:t xml:space="preserve">Final live test: 60 of 60 LCD outputs correct (10 sign classes, 3 times each over two runs)</w:t>
       </w:r>
     </w:p>
     <w:p>
@@ -507,7 +507,25 @@
         <w:rPr>
           <w:sz w:val="24"/>
         </w:rPr>
-        <w:t xml:space="preserve">Prepared the weekly slides and report (1 hour)</w:t>
+        <w:t xml:space="preserve">Wrote the OpenCV troubleshooting guide documenting each problem and fix</w:t>
+      </w:r>
+    </w:p>
+    <w:p>
+      <w:pPr>
+        <w:numPr>
+          <w:ilvl w:val="1"/>
+          <w:numId w:val="6"/>
+        </w:numPr>
+        <w:rPr>
+          <w:sz w:val="24"/>
+          <w:szCs w:val="24"/>
+        </w:rPr>
+      </w:pPr>
+      <w:r>
+        <w:rPr>
+          <w:sz w:val="24"/>
+        </w:rPr>
+        <w:t xml:space="preserve">Prepared the weekly slides and report</w:t>
       </w:r>
     </w:p>
     <w:p>
@@ -544,7 +562,7 @@
         <w:rPr>
           <w:sz w:val="24"/>
         </w:rPr>
-        <w:t xml:space="preserve">Continued the OpenCV course and tested OpenCV on a webcam (2 hours)</w:t>
+        <w:t xml:space="preserve">Wrote the first sign-detection demo script for the CM5: Pi camera, OpenCV sign regions, combined model, and LCD output</w:t>
       </w:r>
     </w:p>
     <w:p>
@@ -562,7 +580,7 @@
         <w:rPr>
           <w:sz w:val="24"/>
         </w:rPr>
-        <w:t xml:space="preserve">Ordered a car chassis to test the vehicle components together (1 hour)</w:t>
+        <w:t xml:space="preserve">Tested OpenCV with a laptop webcam and wrote OpenCV setup instructions and test scripts</w:t>
       </w:r>
     </w:p>
     <w:p>
@@ -580,7 +598,7 @@
         <w:rPr>
           <w:sz w:val="24"/>
         </w:rPr>
-        <w:t xml:space="preserve">Wrote a TCRT5000 IR line-sensor script for the Raspberry Pi that reads the left and right course-line sensors and reports a lane action (3 hours)</w:t>
+        <w:t xml:space="preserve">Moved the line sensors to GPIO20 and GPIO21 to avoid a pin clash with the Cokoino motor HAT</w:t>
       </w:r>
     </w:p>
     <w:p>
@@ -617,7 +635,7 @@
         <w:rPr>
           <w:sz w:val="24"/>
         </w:rPr>
-        <w:t xml:space="preserve">Installed ROS 2 under Windows Subsystem for Linux and drafted the ROS 2 node structure for the camera, sign detector, line sensor, IMU, behavior, motor driver, LCD, and teleop (4 hours)</w:t>
+        <w:t xml:space="preserve">Built a master test script for every sensor and the motor driver (line sensors, IMU, camera, LCD, motors) with a pass/fail summary</w:t>
       </w:r>
     </w:p>
     <w:p>
@@ -635,7 +653,25 @@
         <w:rPr>
           <w:sz w:val="24"/>
         </w:rPr>
-        <w:t xml:space="preserve">Drafted the ROS 2 data flow in which the behavior node turns lane, sign, and IMU data into driving decisions (2 hours)</w:t>
+        <w:t xml:space="preserve">Ran the ROS 2 turtlesim tutorial under Windows Subsystem for Linux</w:t>
+      </w:r>
+    </w:p>
+    <w:p>
+      <w:pPr>
+        <w:numPr>
+          <w:ilvl w:val="1"/>
+          <w:numId w:val="6"/>
+        </w:numPr>
+        <w:rPr>
+          <w:sz w:val="24"/>
+          <w:szCs w:val="24"/>
+        </w:rPr>
+      </w:pPr>
+      <w:r>
+        <w:rPr>
+          <w:sz w:val="24"/>
+        </w:rPr>
+        <w:t xml:space="preserve">Started the ROS 2 test program</w:t>
       </w:r>
     </w:p>
     <w:p>
@@ -672,7 +708,7 @@
         <w:rPr>
           <w:sz w:val="24"/>
         </w:rPr>
-        <w:t xml:space="preserve">Created an organized component checklist/spreadsheet for the PCB design (2 hours)</w:t>
+        <w:t xml:space="preserve">Added the required new components to the PCB design</w:t>
       </w:r>
     </w:p>
     <w:p>
@@ -690,7 +726,7 @@
         <w:rPr>
           <w:sz w:val="24"/>
         </w:rPr>
-        <w:t xml:space="preserve">Reviewed the CM5 IO Board components and connections to determine which features should be kept, removed, or modified (2 hours)</w:t>
+        <w:t xml:space="preserve">Began tracing the connections on the board</w:t>
       </w:r>
     </w:p>
     <w:p>
@@ -708,7 +744,7 @@
         <w:rPr>
           <w:sz w:val="24"/>
         </w:rPr>
-        <w:t xml:space="preserve">Added the IMU and LCD connectors to the board layout (2 hours)</w:t>
+        <w:t xml:space="preserve">Ordered STEMMA QT / Qwiic I2C cables</w:t>
       </w:r>
     </w:p>
     <w:p>
@@ -933,7 +969,7 @@
               <w:rPr>
                 <w:sz w:val="24"/>
               </w:rPr>
-              <w:t xml:space="preserve">7</w:t>
+              <w:t xml:space="preserve">10</w:t>
             </w:r>
           </w:p>
         </w:tc>
@@ -967,7 +1003,7 @@
               <w:rPr>
                 <w:sz w:val="24"/>
               </w:rPr>
-              <w:t xml:space="preserve">48</w:t>
+              <w:t xml:space="preserve">58</w:t>
             </w:r>
           </w:p>
         </w:tc>
@@ -1037,7 +1073,7 @@
               <w:rPr>
                 <w:sz w:val="24"/>
               </w:rPr>
-              <w:t xml:space="preserve">6</w:t>
+              <w:t xml:space="preserve">7</w:t>
             </w:r>
           </w:p>
         </w:tc>
@@ -1071,7 +1107,7 @@
               <w:rPr>
                 <w:sz w:val="24"/>
               </w:rPr>
-              <w:t xml:space="preserve">41</w:t>
+              <w:t xml:space="preserve">48</w:t>
             </w:r>
           </w:p>
         </w:tc>
@@ -1175,7 +1211,7 @@
               <w:rPr>
                 <w:sz w:val="24"/>
               </w:rPr>
-              <w:t xml:space="preserve">40</w:t>
+              <w:t xml:space="preserve">46</w:t>
             </w:r>
           </w:p>
         </w:tc>
@@ -1279,7 +1315,7 @@
               <w:rPr>
                 <w:sz w:val="24"/>
               </w:rPr>
-              <w:t xml:space="preserve">41</w:t>
+              <w:t xml:space="preserve">47</w:t>
             </w:r>
           </w:p>
         </w:tc>

</xml_diff>